<commit_message>
docs: strengthen draft for province journal submission
</commit_message>
<xml_diff>
--- a/manuscript/submission-version.docx
+++ b/manuscript/submission-version.docx
@@ -625,6 +625,524 @@
     </w:p>
     <w:p>
       <w:pPr>
+        <w:spacing w:before="120" w:after="200"/>
+        <w:jc w:val="center"/>
+      </w:pPr>
+      <w:r>
+        <w:rPr>
+          <w:rFonts w:ascii="Calibri" w:hAnsi="Calibri" w:eastAsia="SimSun"/>
+          <w:b w:val="0"/>
+          <w:color w:val="555555"/>
+          <w:sz w:val="20"/>
+        </w:rPr>
+        <w:t>表1 课程群、竞赛任务与能力目标对应关系</w:t>
+      </w:r>
+    </w:p>
+    <w:tbl>
+      <w:tblPr>
+        <w:tblStyle w:val="TableGrid"/>
+        <w:tblW w:type="dxa" w:w="9360"/>
+        <w:jc w:val="left"/>
+        <w:tblLayout w:type="fixed"/>
+        <w:tblLook w:firstColumn="1" w:firstRow="1" w:lastColumn="0" w:lastRow="0" w:noHBand="0" w:noVBand="1" w:val="04A0"/>
+        <w:tblInd w:w="120" w:type="dxa"/>
+      </w:tblPr>
+      <w:tblGrid>
+        <w:gridCol w:w="3120"/>
+        <w:gridCol w:w="3120"/>
+        <w:gridCol w:w="3120"/>
+      </w:tblGrid>
+      <w:tr>
+        <w:tc>
+          <w:tcPr>
+            <w:tcW w:type="dxa" w:w="2200"/>
+            <w:vAlign w:val="center"/>
+            <w:tcMar>
+              <w:top w:w="80" w:type="dxa"/>
+              <w:bottom w:w="80" w:type="dxa"/>
+              <w:start w:w="120" w:type="dxa"/>
+              <w:end w:w="120" w:type="dxa"/>
+            </w:tcMar>
+            <w:shd w:fill="F4F6F9"/>
+          </w:tcPr>
+          <w:p>
+            <w:pPr>
+              <w:spacing w:after="0" w:line="280" w:lineRule="auto"/>
+              <w:jc w:val="center"/>
+            </w:pPr>
+            <w:r>
+              <w:rPr>
+                <w:rFonts w:ascii="Calibri" w:hAnsi="Calibri" w:eastAsia="SimSun"/>
+                <w:b/>
+                <w:sz w:val="20"/>
+              </w:rPr>
+              <w:t>课程或课程群</w:t>
+            </w:r>
+          </w:p>
+        </w:tc>
+        <w:tc>
+          <w:tcPr>
+            <w:tcW w:type="dxa" w:w="3400"/>
+            <w:vAlign w:val="center"/>
+            <w:tcMar>
+              <w:top w:w="80" w:type="dxa"/>
+              <w:bottom w:w="80" w:type="dxa"/>
+              <w:start w:w="120" w:type="dxa"/>
+              <w:end w:w="120" w:type="dxa"/>
+            </w:tcMar>
+            <w:shd w:fill="F4F6F9"/>
+          </w:tcPr>
+          <w:p>
+            <w:pPr>
+              <w:spacing w:after="0" w:line="280" w:lineRule="auto"/>
+              <w:jc w:val="center"/>
+            </w:pPr>
+            <w:r>
+              <w:rPr>
+                <w:rFonts w:ascii="Calibri" w:hAnsi="Calibri" w:eastAsia="SimSun"/>
+                <w:b/>
+                <w:sz w:val="20"/>
+              </w:rPr>
+              <w:t>对应竞赛任务</w:t>
+            </w:r>
+          </w:p>
+        </w:tc>
+        <w:tc>
+          <w:tcPr>
+            <w:tcW w:type="dxa" w:w="3760"/>
+            <w:vAlign w:val="center"/>
+            <w:tcMar>
+              <w:top w:w="80" w:type="dxa"/>
+              <w:bottom w:w="80" w:type="dxa"/>
+              <w:start w:w="120" w:type="dxa"/>
+              <w:end w:w="120" w:type="dxa"/>
+            </w:tcMar>
+            <w:shd w:fill="F4F6F9"/>
+          </w:tcPr>
+          <w:p>
+            <w:pPr>
+              <w:spacing w:after="0" w:line="280" w:lineRule="auto"/>
+              <w:jc w:val="center"/>
+            </w:pPr>
+            <w:r>
+              <w:rPr>
+                <w:rFonts w:ascii="Calibri" w:hAnsi="Calibri" w:eastAsia="SimSun"/>
+                <w:b/>
+                <w:sz w:val="20"/>
+              </w:rPr>
+              <w:t>能力培养目标</w:t>
+            </w:r>
+          </w:p>
+        </w:tc>
+      </w:tr>
+      <w:tr>
+        <w:tc>
+          <w:tcPr>
+            <w:tcW w:type="dxa" w:w="2200"/>
+            <w:vAlign w:val="center"/>
+            <w:tcMar>
+              <w:top w:w="80" w:type="dxa"/>
+              <w:bottom w:w="80" w:type="dxa"/>
+              <w:start w:w="120" w:type="dxa"/>
+              <w:end w:w="120" w:type="dxa"/>
+            </w:tcMar>
+          </w:tcPr>
+          <w:p>
+            <w:pPr>
+              <w:spacing w:after="0" w:line="280" w:lineRule="auto"/>
+              <w:jc w:val="left"/>
+            </w:pPr>
+            <w:r>
+              <w:rPr>
+                <w:rFonts w:ascii="Calibri" w:hAnsi="Calibri" w:eastAsia="SimSun"/>
+                <w:b w:val="0"/>
+                <w:sz w:val="20"/>
+              </w:rPr>
+              <w:t>电路与模拟电子技术</w:t>
+            </w:r>
+          </w:p>
+        </w:tc>
+        <w:tc>
+          <w:tcPr>
+            <w:tcW w:type="dxa" w:w="3400"/>
+            <w:vAlign w:val="center"/>
+            <w:tcMar>
+              <w:top w:w="80" w:type="dxa"/>
+              <w:bottom w:w="80" w:type="dxa"/>
+              <w:start w:w="120" w:type="dxa"/>
+              <w:end w:w="120" w:type="dxa"/>
+            </w:tcMar>
+          </w:tcPr>
+          <w:p>
+            <w:pPr>
+              <w:spacing w:after="0" w:line="280" w:lineRule="auto"/>
+              <w:jc w:val="left"/>
+            </w:pPr>
+            <w:r>
+              <w:rPr>
+                <w:rFonts w:ascii="Calibri" w:hAnsi="Calibri" w:eastAsia="SimSun"/>
+                <w:b w:val="0"/>
+                <w:sz w:val="20"/>
+              </w:rPr>
+              <w:t>电源模块、传感器采集、信号调理</w:t>
+            </w:r>
+          </w:p>
+        </w:tc>
+        <w:tc>
+          <w:tcPr>
+            <w:tcW w:type="dxa" w:w="3760"/>
+            <w:vAlign w:val="center"/>
+            <w:tcMar>
+              <w:top w:w="80" w:type="dxa"/>
+              <w:bottom w:w="80" w:type="dxa"/>
+              <w:start w:w="120" w:type="dxa"/>
+              <w:end w:w="120" w:type="dxa"/>
+            </w:tcMar>
+          </w:tcPr>
+          <w:p>
+            <w:pPr>
+              <w:spacing w:after="0" w:line="280" w:lineRule="auto"/>
+              <w:jc w:val="left"/>
+            </w:pPr>
+            <w:r>
+              <w:rPr>
+                <w:rFonts w:ascii="Calibri" w:hAnsi="Calibri" w:eastAsia="SimSun"/>
+                <w:b w:val="0"/>
+                <w:sz w:val="20"/>
+              </w:rPr>
+              <w:t>提升电路设计、硬件调试和故障分析能力</w:t>
+            </w:r>
+          </w:p>
+        </w:tc>
+      </w:tr>
+      <w:tr>
+        <w:tc>
+          <w:tcPr>
+            <w:tcW w:type="dxa" w:w="2200"/>
+            <w:vAlign w:val="center"/>
+            <w:tcMar>
+              <w:top w:w="80" w:type="dxa"/>
+              <w:bottom w:w="80" w:type="dxa"/>
+              <w:start w:w="120" w:type="dxa"/>
+              <w:end w:w="120" w:type="dxa"/>
+            </w:tcMar>
+          </w:tcPr>
+          <w:p>
+            <w:pPr>
+              <w:spacing w:after="0" w:line="280" w:lineRule="auto"/>
+              <w:jc w:val="left"/>
+            </w:pPr>
+            <w:r>
+              <w:rPr>
+                <w:rFonts w:ascii="Calibri" w:hAnsi="Calibri" w:eastAsia="SimSun"/>
+                <w:b w:val="0"/>
+                <w:sz w:val="20"/>
+              </w:rPr>
+              <w:t>单片机与嵌入式系统</w:t>
+            </w:r>
+          </w:p>
+        </w:tc>
+        <w:tc>
+          <w:tcPr>
+            <w:tcW w:type="dxa" w:w="3400"/>
+            <w:vAlign w:val="center"/>
+            <w:tcMar>
+              <w:top w:w="80" w:type="dxa"/>
+              <w:bottom w:w="80" w:type="dxa"/>
+              <w:start w:w="120" w:type="dxa"/>
+              <w:end w:w="120" w:type="dxa"/>
+            </w:tcMar>
+          </w:tcPr>
+          <w:p>
+            <w:pPr>
+              <w:spacing w:after="0" w:line="280" w:lineRule="auto"/>
+              <w:jc w:val="left"/>
+            </w:pPr>
+            <w:r>
+              <w:rPr>
+                <w:rFonts w:ascii="Calibri" w:hAnsi="Calibri" w:eastAsia="SimSun"/>
+                <w:b w:val="0"/>
+                <w:sz w:val="20"/>
+              </w:rPr>
+              <w:t>电机控制、通信协议、底盘控制</w:t>
+            </w:r>
+          </w:p>
+        </w:tc>
+        <w:tc>
+          <w:tcPr>
+            <w:tcW w:type="dxa" w:w="3760"/>
+            <w:vAlign w:val="center"/>
+            <w:tcMar>
+              <w:top w:w="80" w:type="dxa"/>
+              <w:bottom w:w="80" w:type="dxa"/>
+              <w:start w:w="120" w:type="dxa"/>
+              <w:end w:w="120" w:type="dxa"/>
+            </w:tcMar>
+          </w:tcPr>
+          <w:p>
+            <w:pPr>
+              <w:spacing w:after="0" w:line="280" w:lineRule="auto"/>
+              <w:jc w:val="left"/>
+            </w:pPr>
+            <w:r>
+              <w:rPr>
+                <w:rFonts w:ascii="Calibri" w:hAnsi="Calibri" w:eastAsia="SimSun"/>
+                <w:b w:val="0"/>
+                <w:sz w:val="20"/>
+              </w:rPr>
+              <w:t>提升嵌入式开发、接口设计和系统联调能力</w:t>
+            </w:r>
+          </w:p>
+        </w:tc>
+      </w:tr>
+      <w:tr>
+        <w:tc>
+          <w:tcPr>
+            <w:tcW w:type="dxa" w:w="2200"/>
+            <w:vAlign w:val="center"/>
+            <w:tcMar>
+              <w:top w:w="80" w:type="dxa"/>
+              <w:bottom w:w="80" w:type="dxa"/>
+              <w:start w:w="120" w:type="dxa"/>
+              <w:end w:w="120" w:type="dxa"/>
+            </w:tcMar>
+          </w:tcPr>
+          <w:p>
+            <w:pPr>
+              <w:spacing w:after="0" w:line="280" w:lineRule="auto"/>
+              <w:jc w:val="left"/>
+            </w:pPr>
+            <w:r>
+              <w:rPr>
+                <w:rFonts w:ascii="Calibri" w:hAnsi="Calibri" w:eastAsia="SimSun"/>
+                <w:b w:val="0"/>
+                <w:sz w:val="20"/>
+              </w:rPr>
+              <w:t>自动控制原理</w:t>
+            </w:r>
+          </w:p>
+        </w:tc>
+        <w:tc>
+          <w:tcPr>
+            <w:tcW w:type="dxa" w:w="3400"/>
+            <w:vAlign w:val="center"/>
+            <w:tcMar>
+              <w:top w:w="80" w:type="dxa"/>
+              <w:bottom w:w="80" w:type="dxa"/>
+              <w:start w:w="120" w:type="dxa"/>
+              <w:end w:w="120" w:type="dxa"/>
+            </w:tcMar>
+          </w:tcPr>
+          <w:p>
+            <w:pPr>
+              <w:spacing w:after="0" w:line="280" w:lineRule="auto"/>
+              <w:jc w:val="left"/>
+            </w:pPr>
+            <w:r>
+              <w:rPr>
+                <w:rFonts w:ascii="Calibri" w:hAnsi="Calibri" w:eastAsia="SimSun"/>
+                <w:b w:val="0"/>
+                <w:sz w:val="20"/>
+              </w:rPr>
+              <w:t>PID 调试、运动控制、轨迹跟踪</w:t>
+            </w:r>
+          </w:p>
+        </w:tc>
+        <w:tc>
+          <w:tcPr>
+            <w:tcW w:type="dxa" w:w="3760"/>
+            <w:vAlign w:val="center"/>
+            <w:tcMar>
+              <w:top w:w="80" w:type="dxa"/>
+              <w:bottom w:w="80" w:type="dxa"/>
+              <w:start w:w="120" w:type="dxa"/>
+              <w:end w:w="120" w:type="dxa"/>
+            </w:tcMar>
+          </w:tcPr>
+          <w:p>
+            <w:pPr>
+              <w:spacing w:after="0" w:line="280" w:lineRule="auto"/>
+              <w:jc w:val="left"/>
+            </w:pPr>
+            <w:r>
+              <w:rPr>
+                <w:rFonts w:ascii="Calibri" w:hAnsi="Calibri" w:eastAsia="SimSun"/>
+                <w:b w:val="0"/>
+                <w:sz w:val="20"/>
+              </w:rPr>
+              <w:t>提升控制建模、参数整定和动态系统分析能力</w:t>
+            </w:r>
+          </w:p>
+        </w:tc>
+      </w:tr>
+      <w:tr>
+        <w:tc>
+          <w:tcPr>
+            <w:tcW w:type="dxa" w:w="2200"/>
+            <w:vAlign w:val="center"/>
+            <w:tcMar>
+              <w:top w:w="80" w:type="dxa"/>
+              <w:bottom w:w="80" w:type="dxa"/>
+              <w:start w:w="120" w:type="dxa"/>
+              <w:end w:w="120" w:type="dxa"/>
+            </w:tcMar>
+          </w:tcPr>
+          <w:p>
+            <w:pPr>
+              <w:spacing w:after="0" w:line="280" w:lineRule="auto"/>
+              <w:jc w:val="left"/>
+            </w:pPr>
+            <w:r>
+              <w:rPr>
+                <w:rFonts w:ascii="Calibri" w:hAnsi="Calibri" w:eastAsia="SimSun"/>
+                <w:b w:val="0"/>
+                <w:sz w:val="20"/>
+              </w:rPr>
+              <w:t>机械设计基础</w:t>
+            </w:r>
+          </w:p>
+        </w:tc>
+        <w:tc>
+          <w:tcPr>
+            <w:tcW w:type="dxa" w:w="3400"/>
+            <w:vAlign w:val="center"/>
+            <w:tcMar>
+              <w:top w:w="80" w:type="dxa"/>
+              <w:bottom w:w="80" w:type="dxa"/>
+              <w:start w:w="120" w:type="dxa"/>
+              <w:end w:w="120" w:type="dxa"/>
+            </w:tcMar>
+          </w:tcPr>
+          <w:p>
+            <w:pPr>
+              <w:spacing w:after="0" w:line="280" w:lineRule="auto"/>
+              <w:jc w:val="left"/>
+            </w:pPr>
+            <w:r>
+              <w:rPr>
+                <w:rFonts w:ascii="Calibri" w:hAnsi="Calibri" w:eastAsia="SimSun"/>
+                <w:b w:val="0"/>
+                <w:sz w:val="20"/>
+              </w:rPr>
+              <w:t>机构设计、传动设计、结构优化</w:t>
+            </w:r>
+          </w:p>
+        </w:tc>
+        <w:tc>
+          <w:tcPr>
+            <w:tcW w:type="dxa" w:w="3760"/>
+            <w:vAlign w:val="center"/>
+            <w:tcMar>
+              <w:top w:w="80" w:type="dxa"/>
+              <w:bottom w:w="80" w:type="dxa"/>
+              <w:start w:w="120" w:type="dxa"/>
+              <w:end w:w="120" w:type="dxa"/>
+            </w:tcMar>
+          </w:tcPr>
+          <w:p>
+            <w:pPr>
+              <w:spacing w:after="0" w:line="280" w:lineRule="auto"/>
+              <w:jc w:val="left"/>
+            </w:pPr>
+            <w:r>
+              <w:rPr>
+                <w:rFonts w:ascii="Calibri" w:hAnsi="Calibri" w:eastAsia="SimSun"/>
+                <w:b w:val="0"/>
+                <w:sz w:val="20"/>
+              </w:rPr>
+              <w:t>提升结构设计、加工装配和工程迭代能力</w:t>
+            </w:r>
+          </w:p>
+        </w:tc>
+      </w:tr>
+      <w:tr>
+        <w:tc>
+          <w:tcPr>
+            <w:tcW w:type="dxa" w:w="2200"/>
+            <w:vAlign w:val="center"/>
+            <w:tcMar>
+              <w:top w:w="80" w:type="dxa"/>
+              <w:bottom w:w="80" w:type="dxa"/>
+              <w:start w:w="120" w:type="dxa"/>
+              <w:end w:w="120" w:type="dxa"/>
+            </w:tcMar>
+          </w:tcPr>
+          <w:p>
+            <w:pPr>
+              <w:spacing w:after="0" w:line="280" w:lineRule="auto"/>
+              <w:jc w:val="left"/>
+            </w:pPr>
+            <w:r>
+              <w:rPr>
+                <w:rFonts w:ascii="Calibri" w:hAnsi="Calibri" w:eastAsia="SimSun"/>
+                <w:b w:val="0"/>
+                <w:sz w:val="20"/>
+              </w:rPr>
+              <w:t>计算机视觉与人工智能基础</w:t>
+            </w:r>
+          </w:p>
+        </w:tc>
+        <w:tc>
+          <w:tcPr>
+            <w:tcW w:type="dxa" w:w="3400"/>
+            <w:vAlign w:val="center"/>
+            <w:tcMar>
+              <w:top w:w="80" w:type="dxa"/>
+              <w:bottom w:w="80" w:type="dxa"/>
+              <w:start w:w="120" w:type="dxa"/>
+              <w:end w:w="120" w:type="dxa"/>
+            </w:tcMar>
+          </w:tcPr>
+          <w:p>
+            <w:pPr>
+              <w:spacing w:after="0" w:line="280" w:lineRule="auto"/>
+              <w:jc w:val="left"/>
+            </w:pPr>
+            <w:r>
+              <w:rPr>
+                <w:rFonts w:ascii="Calibri" w:hAnsi="Calibri" w:eastAsia="SimSun"/>
+                <w:b w:val="0"/>
+                <w:sz w:val="20"/>
+              </w:rPr>
+              <w:t>目标识别、图像处理、策略决策</w:t>
+            </w:r>
+          </w:p>
+        </w:tc>
+        <w:tc>
+          <w:tcPr>
+            <w:tcW w:type="dxa" w:w="3760"/>
+            <w:vAlign w:val="center"/>
+            <w:tcMar>
+              <w:top w:w="80" w:type="dxa"/>
+              <w:bottom w:w="80" w:type="dxa"/>
+              <w:start w:w="120" w:type="dxa"/>
+              <w:end w:w="120" w:type="dxa"/>
+            </w:tcMar>
+          </w:tcPr>
+          <w:p>
+            <w:pPr>
+              <w:spacing w:after="0" w:line="280" w:lineRule="auto"/>
+              <w:jc w:val="left"/>
+            </w:pPr>
+            <w:r>
+              <w:rPr>
+                <w:rFonts w:ascii="Calibri" w:hAnsi="Calibri" w:eastAsia="SimSun"/>
+                <w:b w:val="0"/>
+                <w:sz w:val="20"/>
+              </w:rPr>
+              <w:t>提升算法应用、数据处理和智能控制能力</w:t>
+            </w:r>
+          </w:p>
+        </w:tc>
+      </w:tr>
+    </w:tbl>
+    <w:p>
+      <w:pPr>
+        <w:spacing w:after="120"/>
+      </w:pPr>
+    </w:p>
+    <w:p>
+      <w:pPr>
         <w:pStyle w:val="Heading1"/>
       </w:pPr>
       <w:r>
@@ -928,6 +1446,524 @@
         </w:rPr>
         <w:t>需要看到的是，赛教融合模式的运行仍需进一步完善。首先，应建立更加科学的评价体系，避免单纯以竞赛获奖作为评价标准，而应关注学生参与过程、能力提升、项目贡献和课程学习成效。其次，应完善资源保障机制，在场地、设备、耗材、开放实验室和教师指导工作量等方面形成稳定支持。再次，应加强竞赛成果沉淀，推动项目文档、课程案例、实验任务和复盘材料规范化保存。最后，应进一步拓展学生参与面，使竞赛育人成果能够惠及更多学生，而不是停留在少数团队成员内部。只有在持续改进中完善机制，赛教融合才能真正服务于应用型工程人才培养。</w:t>
       </w:r>
+    </w:p>
+    <w:p>
+      <w:pPr>
+        <w:spacing w:before="120" w:after="200"/>
+        <w:jc w:val="center"/>
+      </w:pPr>
+      <w:r>
+        <w:rPr>
+          <w:rFonts w:ascii="Calibri" w:hAnsi="Calibri" w:eastAsia="SimSun"/>
+          <w:b w:val="0"/>
+          <w:color w:val="555555"/>
+          <w:sz w:val="20"/>
+        </w:rPr>
+        <w:t>表2 赛教融合实施内容与育人成效对应关系</w:t>
+      </w:r>
+    </w:p>
+    <w:tbl>
+      <w:tblPr>
+        <w:tblStyle w:val="TableGrid"/>
+        <w:tblW w:type="dxa" w:w="9360"/>
+        <w:jc w:val="left"/>
+        <w:tblLayout w:type="fixed"/>
+        <w:tblLook w:firstColumn="1" w:firstRow="1" w:lastColumn="0" w:lastRow="0" w:noHBand="0" w:noVBand="1" w:val="04A0"/>
+        <w:tblInd w:w="120" w:type="dxa"/>
+      </w:tblPr>
+      <w:tblGrid>
+        <w:gridCol w:w="3120"/>
+        <w:gridCol w:w="3120"/>
+        <w:gridCol w:w="3120"/>
+      </w:tblGrid>
+      <w:tr>
+        <w:tc>
+          <w:tcPr>
+            <w:tcW w:type="dxa" w:w="2200"/>
+            <w:vAlign w:val="center"/>
+            <w:tcMar>
+              <w:top w:w="80" w:type="dxa"/>
+              <w:bottom w:w="80" w:type="dxa"/>
+              <w:start w:w="120" w:type="dxa"/>
+              <w:end w:w="120" w:type="dxa"/>
+            </w:tcMar>
+            <w:shd w:fill="F4F6F9"/>
+          </w:tcPr>
+          <w:p>
+            <w:pPr>
+              <w:spacing w:after="0" w:line="280" w:lineRule="auto"/>
+              <w:jc w:val="center"/>
+            </w:pPr>
+            <w:r>
+              <w:rPr>
+                <w:rFonts w:ascii="Calibri" w:hAnsi="Calibri" w:eastAsia="SimSun"/>
+                <w:b/>
+                <w:sz w:val="20"/>
+              </w:rPr>
+              <w:t>实施内容</w:t>
+            </w:r>
+          </w:p>
+        </w:tc>
+        <w:tc>
+          <w:tcPr>
+            <w:tcW w:type="dxa" w:w="3400"/>
+            <w:vAlign w:val="center"/>
+            <w:tcMar>
+              <w:top w:w="80" w:type="dxa"/>
+              <w:bottom w:w="80" w:type="dxa"/>
+              <w:start w:w="120" w:type="dxa"/>
+              <w:end w:w="120" w:type="dxa"/>
+            </w:tcMar>
+            <w:shd w:fill="F4F6F9"/>
+          </w:tcPr>
+          <w:p>
+            <w:pPr>
+              <w:spacing w:after="0" w:line="280" w:lineRule="auto"/>
+              <w:jc w:val="center"/>
+            </w:pPr>
+            <w:r>
+              <w:rPr>
+                <w:rFonts w:ascii="Calibri" w:hAnsi="Calibri" w:eastAsia="SimSun"/>
+                <w:b/>
+                <w:sz w:val="20"/>
+              </w:rPr>
+              <w:t>主要做法</w:t>
+            </w:r>
+          </w:p>
+        </w:tc>
+        <w:tc>
+          <w:tcPr>
+            <w:tcW w:type="dxa" w:w="3760"/>
+            <w:vAlign w:val="center"/>
+            <w:tcMar>
+              <w:top w:w="80" w:type="dxa"/>
+              <w:bottom w:w="80" w:type="dxa"/>
+              <w:start w:w="120" w:type="dxa"/>
+              <w:end w:w="120" w:type="dxa"/>
+            </w:tcMar>
+            <w:shd w:fill="F4F6F9"/>
+          </w:tcPr>
+          <w:p>
+            <w:pPr>
+              <w:spacing w:after="0" w:line="280" w:lineRule="auto"/>
+              <w:jc w:val="center"/>
+            </w:pPr>
+            <w:r>
+              <w:rPr>
+                <w:rFonts w:ascii="Calibri" w:hAnsi="Calibri" w:eastAsia="SimSun"/>
+                <w:b/>
+                <w:sz w:val="20"/>
+              </w:rPr>
+              <w:t>育人成效</w:t>
+            </w:r>
+          </w:p>
+        </w:tc>
+      </w:tr>
+      <w:tr>
+        <w:tc>
+          <w:tcPr>
+            <w:tcW w:type="dxa" w:w="2200"/>
+            <w:vAlign w:val="center"/>
+            <w:tcMar>
+              <w:top w:w="80" w:type="dxa"/>
+              <w:bottom w:w="80" w:type="dxa"/>
+              <w:start w:w="120" w:type="dxa"/>
+              <w:end w:w="120" w:type="dxa"/>
+            </w:tcMar>
+          </w:tcPr>
+          <w:p>
+            <w:pPr>
+              <w:spacing w:after="0" w:line="280" w:lineRule="auto"/>
+              <w:jc w:val="left"/>
+            </w:pPr>
+            <w:r>
+              <w:rPr>
+                <w:rFonts w:ascii="Calibri" w:hAnsi="Calibri" w:eastAsia="SimSun"/>
+                <w:b w:val="0"/>
+                <w:sz w:val="20"/>
+              </w:rPr>
+              <w:t>跨专业竞赛团队建设</w:t>
+            </w:r>
+          </w:p>
+        </w:tc>
+        <w:tc>
+          <w:tcPr>
+            <w:tcW w:type="dxa" w:w="3400"/>
+            <w:vAlign w:val="center"/>
+            <w:tcMar>
+              <w:top w:w="80" w:type="dxa"/>
+              <w:bottom w:w="80" w:type="dxa"/>
+              <w:start w:w="120" w:type="dxa"/>
+              <w:end w:w="120" w:type="dxa"/>
+            </w:tcMar>
+          </w:tcPr>
+          <w:p>
+            <w:pPr>
+              <w:spacing w:after="0" w:line="280" w:lineRule="auto"/>
+              <w:jc w:val="left"/>
+            </w:pPr>
+            <w:r>
+              <w:rPr>
+                <w:rFonts w:ascii="Calibri" w:hAnsi="Calibri" w:eastAsia="SimSun"/>
+                <w:b w:val="0"/>
+                <w:sz w:val="20"/>
+              </w:rPr>
+              <w:t>吸纳电子信息、机械、自动化、计算机等专业学生共同参与</w:t>
+            </w:r>
+          </w:p>
+        </w:tc>
+        <w:tc>
+          <w:tcPr>
+            <w:tcW w:type="dxa" w:w="3760"/>
+            <w:vAlign w:val="center"/>
+            <w:tcMar>
+              <w:top w:w="80" w:type="dxa"/>
+              <w:bottom w:w="80" w:type="dxa"/>
+              <w:start w:w="120" w:type="dxa"/>
+              <w:end w:w="120" w:type="dxa"/>
+            </w:tcMar>
+          </w:tcPr>
+          <w:p>
+            <w:pPr>
+              <w:spacing w:after="0" w:line="280" w:lineRule="auto"/>
+              <w:jc w:val="left"/>
+            </w:pPr>
+            <w:r>
+              <w:rPr>
+                <w:rFonts w:ascii="Calibri" w:hAnsi="Calibri" w:eastAsia="SimSun"/>
+                <w:b w:val="0"/>
+                <w:sz w:val="20"/>
+              </w:rPr>
+              <w:t>促进学生理解复杂工程项目中的专业分工与协同关系</w:t>
+            </w:r>
+          </w:p>
+        </w:tc>
+      </w:tr>
+      <w:tr>
+        <w:tc>
+          <w:tcPr>
+            <w:tcW w:type="dxa" w:w="2200"/>
+            <w:vAlign w:val="center"/>
+            <w:tcMar>
+              <w:top w:w="80" w:type="dxa"/>
+              <w:bottom w:w="80" w:type="dxa"/>
+              <w:start w:w="120" w:type="dxa"/>
+              <w:end w:w="120" w:type="dxa"/>
+            </w:tcMar>
+          </w:tcPr>
+          <w:p>
+            <w:pPr>
+              <w:spacing w:after="0" w:line="280" w:lineRule="auto"/>
+              <w:jc w:val="left"/>
+            </w:pPr>
+            <w:r>
+              <w:rPr>
+                <w:rFonts w:ascii="Calibri" w:hAnsi="Calibri" w:eastAsia="SimSun"/>
+                <w:b w:val="0"/>
+                <w:sz w:val="20"/>
+              </w:rPr>
+              <w:t>课程群与竞赛任务衔接</w:t>
+            </w:r>
+          </w:p>
+        </w:tc>
+        <w:tc>
+          <w:tcPr>
+            <w:tcW w:type="dxa" w:w="3400"/>
+            <w:vAlign w:val="center"/>
+            <w:tcMar>
+              <w:top w:w="80" w:type="dxa"/>
+              <w:bottom w:w="80" w:type="dxa"/>
+              <w:start w:w="120" w:type="dxa"/>
+              <w:end w:w="120" w:type="dxa"/>
+            </w:tcMar>
+          </w:tcPr>
+          <w:p>
+            <w:pPr>
+              <w:spacing w:after="0" w:line="280" w:lineRule="auto"/>
+              <w:jc w:val="left"/>
+            </w:pPr>
+            <w:r>
+              <w:rPr>
+                <w:rFonts w:ascii="Calibri" w:hAnsi="Calibri" w:eastAsia="SimSun"/>
+                <w:b w:val="0"/>
+                <w:sz w:val="20"/>
+              </w:rPr>
+              <w:t>将竞赛模块拆解为课程案例、实验项目和课程设计任务</w:t>
+            </w:r>
+          </w:p>
+        </w:tc>
+        <w:tc>
+          <w:tcPr>
+            <w:tcW w:type="dxa" w:w="3760"/>
+            <w:vAlign w:val="center"/>
+            <w:tcMar>
+              <w:top w:w="80" w:type="dxa"/>
+              <w:bottom w:w="80" w:type="dxa"/>
+              <w:start w:w="120" w:type="dxa"/>
+              <w:end w:w="120" w:type="dxa"/>
+            </w:tcMar>
+          </w:tcPr>
+          <w:p>
+            <w:pPr>
+              <w:spacing w:after="0" w:line="280" w:lineRule="auto"/>
+              <w:jc w:val="left"/>
+            </w:pPr>
+            <w:r>
+              <w:rPr>
+                <w:rFonts w:ascii="Calibri" w:hAnsi="Calibri" w:eastAsia="SimSun"/>
+                <w:b w:val="0"/>
+                <w:sz w:val="20"/>
+              </w:rPr>
+              <w:t>增强课程教学的工程真实性和实践导向</w:t>
+            </w:r>
+          </w:p>
+        </w:tc>
+      </w:tr>
+      <w:tr>
+        <w:tc>
+          <w:tcPr>
+            <w:tcW w:type="dxa" w:w="2200"/>
+            <w:vAlign w:val="center"/>
+            <w:tcMar>
+              <w:top w:w="80" w:type="dxa"/>
+              <w:bottom w:w="80" w:type="dxa"/>
+              <w:start w:w="120" w:type="dxa"/>
+              <w:end w:w="120" w:type="dxa"/>
+            </w:tcMar>
+          </w:tcPr>
+          <w:p>
+            <w:pPr>
+              <w:spacing w:after="0" w:line="280" w:lineRule="auto"/>
+              <w:jc w:val="left"/>
+            </w:pPr>
+            <w:r>
+              <w:rPr>
+                <w:rFonts w:ascii="Calibri" w:hAnsi="Calibri" w:eastAsia="SimSun"/>
+                <w:b w:val="0"/>
+                <w:sz w:val="20"/>
+              </w:rPr>
+              <w:t>工作室与项目制训练</w:t>
+            </w:r>
+          </w:p>
+        </w:tc>
+        <w:tc>
+          <w:tcPr>
+            <w:tcW w:type="dxa" w:w="3400"/>
+            <w:vAlign w:val="center"/>
+            <w:tcMar>
+              <w:top w:w="80" w:type="dxa"/>
+              <w:bottom w:w="80" w:type="dxa"/>
+              <w:start w:w="120" w:type="dxa"/>
+              <w:end w:w="120" w:type="dxa"/>
+            </w:tcMar>
+          </w:tcPr>
+          <w:p>
+            <w:pPr>
+              <w:spacing w:after="0" w:line="280" w:lineRule="auto"/>
+              <w:jc w:val="left"/>
+            </w:pPr>
+            <w:r>
+              <w:rPr>
+                <w:rFonts w:ascii="Calibri" w:hAnsi="Calibri" w:eastAsia="SimSun"/>
+                <w:b w:val="0"/>
+                <w:sz w:val="20"/>
+              </w:rPr>
+              <w:t>依托实验室和学生创新工作室开展分层项目训练</w:t>
+            </w:r>
+          </w:p>
+        </w:tc>
+        <w:tc>
+          <w:tcPr>
+            <w:tcW w:type="dxa" w:w="3760"/>
+            <w:vAlign w:val="center"/>
+            <w:tcMar>
+              <w:top w:w="80" w:type="dxa"/>
+              <w:bottom w:w="80" w:type="dxa"/>
+              <w:start w:w="120" w:type="dxa"/>
+              <w:end w:w="120" w:type="dxa"/>
+            </w:tcMar>
+          </w:tcPr>
+          <w:p>
+            <w:pPr>
+              <w:spacing w:after="0" w:line="280" w:lineRule="auto"/>
+              <w:jc w:val="left"/>
+            </w:pPr>
+            <w:r>
+              <w:rPr>
+                <w:rFonts w:ascii="Calibri" w:hAnsi="Calibri" w:eastAsia="SimSun"/>
+                <w:b w:val="0"/>
+                <w:sz w:val="20"/>
+              </w:rPr>
+              <w:t>扩大学生参与面，提升项目实践和持续迭代能力</w:t>
+            </w:r>
+          </w:p>
+        </w:tc>
+      </w:tr>
+      <w:tr>
+        <w:tc>
+          <w:tcPr>
+            <w:tcW w:type="dxa" w:w="2200"/>
+            <w:vAlign w:val="center"/>
+            <w:tcMar>
+              <w:top w:w="80" w:type="dxa"/>
+              <w:bottom w:w="80" w:type="dxa"/>
+              <w:start w:w="120" w:type="dxa"/>
+              <w:end w:w="120" w:type="dxa"/>
+            </w:tcMar>
+          </w:tcPr>
+          <w:p>
+            <w:pPr>
+              <w:spacing w:after="0" w:line="280" w:lineRule="auto"/>
+              <w:jc w:val="left"/>
+            </w:pPr>
+            <w:r>
+              <w:rPr>
+                <w:rFonts w:ascii="Calibri" w:hAnsi="Calibri" w:eastAsia="SimSun"/>
+                <w:b w:val="0"/>
+                <w:sz w:val="20"/>
+              </w:rPr>
+              <w:t>导师组协同指导</w:t>
+            </w:r>
+          </w:p>
+        </w:tc>
+        <w:tc>
+          <w:tcPr>
+            <w:tcW w:type="dxa" w:w="3400"/>
+            <w:vAlign w:val="center"/>
+            <w:tcMar>
+              <w:top w:w="80" w:type="dxa"/>
+              <w:bottom w:w="80" w:type="dxa"/>
+              <w:start w:w="120" w:type="dxa"/>
+              <w:end w:w="120" w:type="dxa"/>
+            </w:tcMar>
+          </w:tcPr>
+          <w:p>
+            <w:pPr>
+              <w:spacing w:after="0" w:line="280" w:lineRule="auto"/>
+              <w:jc w:val="left"/>
+            </w:pPr>
+            <w:r>
+              <w:rPr>
+                <w:rFonts w:ascii="Calibri" w:hAnsi="Calibri" w:eastAsia="SimSun"/>
+                <w:b w:val="0"/>
+                <w:sz w:val="20"/>
+              </w:rPr>
+              <w:t>由不同专业教师围绕结构、电控、算法和管理分工指导</w:t>
+            </w:r>
+          </w:p>
+        </w:tc>
+        <w:tc>
+          <w:tcPr>
+            <w:tcW w:type="dxa" w:w="3760"/>
+            <w:vAlign w:val="center"/>
+            <w:tcMar>
+              <w:top w:w="80" w:type="dxa"/>
+              <w:bottom w:w="80" w:type="dxa"/>
+              <w:start w:w="120" w:type="dxa"/>
+              <w:end w:w="120" w:type="dxa"/>
+            </w:tcMar>
+          </w:tcPr>
+          <w:p>
+            <w:pPr>
+              <w:spacing w:after="0" w:line="280" w:lineRule="auto"/>
+              <w:jc w:val="left"/>
+            </w:pPr>
+            <w:r>
+              <w:rPr>
+                <w:rFonts w:ascii="Calibri" w:hAnsi="Calibri" w:eastAsia="SimSun"/>
+                <w:b w:val="0"/>
+                <w:sz w:val="20"/>
+              </w:rPr>
+              <w:t>提升竞赛训练的系统性，推动教师教学改革协同</w:t>
+            </w:r>
+          </w:p>
+        </w:tc>
+      </w:tr>
+      <w:tr>
+        <w:tc>
+          <w:tcPr>
+            <w:tcW w:type="dxa" w:w="2200"/>
+            <w:vAlign w:val="center"/>
+            <w:tcMar>
+              <w:top w:w="80" w:type="dxa"/>
+              <w:bottom w:w="80" w:type="dxa"/>
+              <w:start w:w="120" w:type="dxa"/>
+              <w:end w:w="120" w:type="dxa"/>
+            </w:tcMar>
+          </w:tcPr>
+          <w:p>
+            <w:pPr>
+              <w:spacing w:after="0" w:line="280" w:lineRule="auto"/>
+              <w:jc w:val="left"/>
+            </w:pPr>
+            <w:r>
+              <w:rPr>
+                <w:rFonts w:ascii="Calibri" w:hAnsi="Calibri" w:eastAsia="SimSun"/>
+                <w:b w:val="0"/>
+                <w:sz w:val="20"/>
+              </w:rPr>
+              <w:t>竞赛成果转化</w:t>
+            </w:r>
+          </w:p>
+        </w:tc>
+        <w:tc>
+          <w:tcPr>
+            <w:tcW w:type="dxa" w:w="3400"/>
+            <w:vAlign w:val="center"/>
+            <w:tcMar>
+              <w:top w:w="80" w:type="dxa"/>
+              <w:bottom w:w="80" w:type="dxa"/>
+              <w:start w:w="120" w:type="dxa"/>
+              <w:end w:w="120" w:type="dxa"/>
+            </w:tcMar>
+          </w:tcPr>
+          <w:p>
+            <w:pPr>
+              <w:spacing w:after="0" w:line="280" w:lineRule="auto"/>
+              <w:jc w:val="left"/>
+            </w:pPr>
+            <w:r>
+              <w:rPr>
+                <w:rFonts w:ascii="Calibri" w:hAnsi="Calibri" w:eastAsia="SimSun"/>
+                <w:b w:val="0"/>
+                <w:sz w:val="20"/>
+              </w:rPr>
+              <w:t>将项目文档、调试案例和学生作品转化为教学资源</w:t>
+            </w:r>
+          </w:p>
+        </w:tc>
+        <w:tc>
+          <w:tcPr>
+            <w:tcW w:type="dxa" w:w="3760"/>
+            <w:vAlign w:val="center"/>
+            <w:tcMar>
+              <w:top w:w="80" w:type="dxa"/>
+              <w:bottom w:w="80" w:type="dxa"/>
+              <w:start w:w="120" w:type="dxa"/>
+              <w:end w:w="120" w:type="dxa"/>
+            </w:tcMar>
+          </w:tcPr>
+          <w:p>
+            <w:pPr>
+              <w:spacing w:after="0" w:line="280" w:lineRule="auto"/>
+              <w:jc w:val="left"/>
+            </w:pPr>
+            <w:r>
+              <w:rPr>
+                <w:rFonts w:ascii="Calibri" w:hAnsi="Calibri" w:eastAsia="SimSun"/>
+                <w:b w:val="0"/>
+                <w:sz w:val="20"/>
+              </w:rPr>
+              <w:t>促进竞赛经验沉淀，支撑实践教学持续改进</w:t>
+            </w:r>
+          </w:p>
+        </w:tc>
+      </w:tr>
+    </w:tbl>
+    <w:p>
+      <w:pPr>
+        <w:spacing w:after="120"/>
+      </w:pPr>
     </w:p>
     <w:p>
       <w:pPr>

</xml_diff>

<commit_message>
docs: add verified competition achievements
</commit_message>
<xml_diff>
--- a/manuscript/submission-version.docx
+++ b/manuscript/submission-version.docx
@@ -1168,7 +1168,7 @@
           <w:rFonts w:ascii="Calibri" w:hAnsi="Calibri" w:eastAsia="SimSun"/>
           <w:sz w:val="22"/>
         </w:rPr>
-        <w:t>以某地方应用型本科高校工科学院为例，工程类学科竞赛的组织不宜按照单一专业或单一赛事孤立推进，而应围绕工程项目需求构建跨专业竞赛团队。Robomaster 和 Robocon 等机器人类赛事通常需要机械结构、电气控制、嵌入式开发、视觉识别和策略规划等多类学生共同参与，全国大学生电子设计竞赛则强调电子电路、控制算法、软件程序和系统调试的综合应用。学校可依托工程类专业群，将电子信息、机械、自动化、计算机等专业学生纳入统一竞赛育人平台，形成多专业交叉、多年级衔接的团队结构。</w:t>
+        <w:t>以某地方应用型本科高校工科学院为例，工程类学科竞赛的组织不宜按照单一专业或单一赛事孤立推进，而应围绕工程项目需求构建跨专业竞赛团队。Robomaster 和 Robocon 等机器人类赛事通常需要机械结构、电气控制、嵌入式开发、视觉识别和策略规划等多类学生共同参与，全国大学生电子设计竞赛则强调电子电路、控制算法、软件程序和系统调试的综合应用。学校可依托工程类专业群和开拓者协会社团，将电子信息、机械、自动化、计算机等专业学生纳入统一竞赛育人平台，形成多专业交叉、多年级衔接的团队结构。</w:t>
       </w:r>
     </w:p>
     <w:p>
@@ -1327,6 +1327,20 @@
           <w:sz w:val="22"/>
         </w:rPr>
         <w:t>学生梯队培养有助于解决竞赛团队成员更替带来的经验流失问题，也有助于扩大竞赛育人覆盖面。通过“老带新”“项目带课程”“竞赛带训练”的方式，竞赛不再只是某一届学生的短期活动，而成为专业实践教学体系中的长期育人平台。对地方应用型本科高校而言，这种梯队机制能够在资源有限的条件下提升竞赛训练效率，促进学生工程实践能力的连续培养。</w:t>
+      </w:r>
+    </w:p>
+    <w:p>
+      <w:pPr>
+        <w:spacing w:before="0" w:after="160" w:line="320" w:lineRule="auto"/>
+        <w:ind w:firstLine="440"/>
+        <w:jc w:val="both"/>
+      </w:pPr>
+      <w:r>
+        <w:rPr>
+          <w:rFonts w:ascii="Calibri" w:hAnsi="Calibri" w:eastAsia="SimSun"/>
+          <w:sz w:val="22"/>
+        </w:rPr>
+        <w:t>在实践推进过程中，开拓者协会社团逐步成为连接课程学习、项目训练和竞赛实践的重要学生组织平台。社团依托工程类竞赛任务组织学生开展模块训练、项目复盘和赛事准备，并在 RoboMaster 步兵对抗赛、RoboMaster 高校联盟赛、RoboCom 机器人开发者大赛等赛事中取得一定成果。这些成果不是本文论述的唯一依据，但能够从侧面说明社团化组织、项目化训练和跨专业协同机制具有较好的实践基础。</w:t>
       </w:r>
     </w:p>
     <w:p>
@@ -1967,6 +1981,524 @@
     </w:p>
     <w:p>
       <w:pPr>
+        <w:spacing w:before="120" w:after="200"/>
+        <w:jc w:val="center"/>
+      </w:pPr>
+      <w:r>
+        <w:rPr>
+          <w:rFonts w:ascii="Calibri" w:hAnsi="Calibri" w:eastAsia="SimSun"/>
+          <w:b w:val="0"/>
+          <w:color w:val="555555"/>
+          <w:sz w:val="20"/>
+        </w:rPr>
+        <w:t>表3 工程类学科竞赛实践成果及其育人支撑</w:t>
+      </w:r>
+    </w:p>
+    <w:tbl>
+      <w:tblPr>
+        <w:tblStyle w:val="TableGrid"/>
+        <w:tblW w:type="dxa" w:w="9360"/>
+        <w:jc w:val="left"/>
+        <w:tblLayout w:type="fixed"/>
+        <w:tblLook w:firstColumn="1" w:firstRow="1" w:lastColumn="0" w:lastRow="0" w:noHBand="0" w:noVBand="1" w:val="04A0"/>
+        <w:tblInd w:w="120" w:type="dxa"/>
+      </w:tblPr>
+      <w:tblGrid>
+        <w:gridCol w:w="3120"/>
+        <w:gridCol w:w="3120"/>
+        <w:gridCol w:w="3120"/>
+      </w:tblGrid>
+      <w:tr>
+        <w:tc>
+          <w:tcPr>
+            <w:tcW w:type="dxa" w:w="2200"/>
+            <w:vAlign w:val="center"/>
+            <w:tcMar>
+              <w:top w:w="80" w:type="dxa"/>
+              <w:bottom w:w="80" w:type="dxa"/>
+              <w:start w:w="120" w:type="dxa"/>
+              <w:end w:w="120" w:type="dxa"/>
+            </w:tcMar>
+            <w:shd w:fill="F4F6F9"/>
+          </w:tcPr>
+          <w:p>
+            <w:pPr>
+              <w:spacing w:after="0" w:line="280" w:lineRule="auto"/>
+              <w:jc w:val="center"/>
+            </w:pPr>
+            <w:r>
+              <w:rPr>
+                <w:rFonts w:ascii="Calibri" w:hAnsi="Calibri" w:eastAsia="SimSun"/>
+                <w:b/>
+                <w:sz w:val="20"/>
+              </w:rPr>
+              <w:t>竞赛或项目</w:t>
+            </w:r>
+          </w:p>
+        </w:tc>
+        <w:tc>
+          <w:tcPr>
+            <w:tcW w:type="dxa" w:w="3400"/>
+            <w:vAlign w:val="center"/>
+            <w:tcMar>
+              <w:top w:w="80" w:type="dxa"/>
+              <w:bottom w:w="80" w:type="dxa"/>
+              <w:start w:w="120" w:type="dxa"/>
+              <w:end w:w="120" w:type="dxa"/>
+            </w:tcMar>
+            <w:shd w:fill="F4F6F9"/>
+          </w:tcPr>
+          <w:p>
+            <w:pPr>
+              <w:spacing w:after="0" w:line="280" w:lineRule="auto"/>
+              <w:jc w:val="center"/>
+            </w:pPr>
+            <w:r>
+              <w:rPr>
+                <w:rFonts w:ascii="Calibri" w:hAnsi="Calibri" w:eastAsia="SimSun"/>
+                <w:b/>
+                <w:sz w:val="20"/>
+              </w:rPr>
+              <w:t>实践成果</w:t>
+            </w:r>
+          </w:p>
+        </w:tc>
+        <w:tc>
+          <w:tcPr>
+            <w:tcW w:type="dxa" w:w="3760"/>
+            <w:vAlign w:val="center"/>
+            <w:tcMar>
+              <w:top w:w="80" w:type="dxa"/>
+              <w:bottom w:w="80" w:type="dxa"/>
+              <w:start w:w="120" w:type="dxa"/>
+              <w:end w:w="120" w:type="dxa"/>
+            </w:tcMar>
+            <w:shd w:fill="F4F6F9"/>
+          </w:tcPr>
+          <w:p>
+            <w:pPr>
+              <w:spacing w:after="0" w:line="280" w:lineRule="auto"/>
+              <w:jc w:val="center"/>
+            </w:pPr>
+            <w:r>
+              <w:rPr>
+                <w:rFonts w:ascii="Calibri" w:hAnsi="Calibri" w:eastAsia="SimSun"/>
+                <w:b/>
+                <w:sz w:val="20"/>
+              </w:rPr>
+              <w:t>育人支撑作用</w:t>
+            </w:r>
+          </w:p>
+        </w:tc>
+      </w:tr>
+      <w:tr>
+        <w:tc>
+          <w:tcPr>
+            <w:tcW w:type="dxa" w:w="2200"/>
+            <w:vAlign w:val="center"/>
+            <w:tcMar>
+              <w:top w:w="80" w:type="dxa"/>
+              <w:bottom w:w="80" w:type="dxa"/>
+              <w:start w:w="120" w:type="dxa"/>
+              <w:end w:w="120" w:type="dxa"/>
+            </w:tcMar>
+          </w:tcPr>
+          <w:p>
+            <w:pPr>
+              <w:spacing w:after="0" w:line="280" w:lineRule="auto"/>
+              <w:jc w:val="left"/>
+            </w:pPr>
+            <w:r>
+              <w:rPr>
+                <w:rFonts w:ascii="Calibri" w:hAnsi="Calibri" w:eastAsia="SimSun"/>
+                <w:b w:val="0"/>
+                <w:sz w:val="20"/>
+              </w:rPr>
+              <w:t>RoboMaster 步兵对抗赛</w:t>
+            </w:r>
+          </w:p>
+        </w:tc>
+        <w:tc>
+          <w:tcPr>
+            <w:tcW w:type="dxa" w:w="3400"/>
+            <w:vAlign w:val="center"/>
+            <w:tcMar>
+              <w:top w:w="80" w:type="dxa"/>
+              <w:bottom w:w="80" w:type="dxa"/>
+              <w:start w:w="120" w:type="dxa"/>
+              <w:end w:w="120" w:type="dxa"/>
+            </w:tcMar>
+          </w:tcPr>
+          <w:p>
+            <w:pPr>
+              <w:spacing w:after="0" w:line="280" w:lineRule="auto"/>
+              <w:jc w:val="left"/>
+            </w:pPr>
+            <w:r>
+              <w:rPr>
+                <w:rFonts w:ascii="Calibri" w:hAnsi="Calibri" w:eastAsia="SimSun"/>
+                <w:b w:val="0"/>
+                <w:sz w:val="20"/>
+              </w:rPr>
+              <w:t>一等奖</w:t>
+            </w:r>
+          </w:p>
+        </w:tc>
+        <w:tc>
+          <w:tcPr>
+            <w:tcW w:type="dxa" w:w="3760"/>
+            <w:vAlign w:val="center"/>
+            <w:tcMar>
+              <w:top w:w="80" w:type="dxa"/>
+              <w:bottom w:w="80" w:type="dxa"/>
+              <w:start w:w="120" w:type="dxa"/>
+              <w:end w:w="120" w:type="dxa"/>
+            </w:tcMar>
+          </w:tcPr>
+          <w:p>
+            <w:pPr>
+              <w:spacing w:after="0" w:line="280" w:lineRule="auto"/>
+              <w:jc w:val="left"/>
+            </w:pPr>
+            <w:r>
+              <w:rPr>
+                <w:rFonts w:ascii="Calibri" w:hAnsi="Calibri" w:eastAsia="SimSun"/>
+                <w:b w:val="0"/>
+                <w:sz w:val="20"/>
+              </w:rPr>
+              <w:t>支撑学生机器人系统设计、对抗策略、底盘控制和团队协作能力培养</w:t>
+            </w:r>
+          </w:p>
+        </w:tc>
+      </w:tr>
+      <w:tr>
+        <w:tc>
+          <w:tcPr>
+            <w:tcW w:type="dxa" w:w="2200"/>
+            <w:vAlign w:val="center"/>
+            <w:tcMar>
+              <w:top w:w="80" w:type="dxa"/>
+              <w:bottom w:w="80" w:type="dxa"/>
+              <w:start w:w="120" w:type="dxa"/>
+              <w:end w:w="120" w:type="dxa"/>
+            </w:tcMar>
+          </w:tcPr>
+          <w:p>
+            <w:pPr>
+              <w:spacing w:after="0" w:line="280" w:lineRule="auto"/>
+              <w:jc w:val="left"/>
+            </w:pPr>
+            <w:r>
+              <w:rPr>
+                <w:rFonts w:ascii="Calibri" w:hAnsi="Calibri" w:eastAsia="SimSun"/>
+                <w:b w:val="0"/>
+                <w:sz w:val="20"/>
+              </w:rPr>
+              <w:t>RoboMaster 高校联盟赛</w:t>
+            </w:r>
+          </w:p>
+        </w:tc>
+        <w:tc>
+          <w:tcPr>
+            <w:tcW w:type="dxa" w:w="3400"/>
+            <w:vAlign w:val="center"/>
+            <w:tcMar>
+              <w:top w:w="80" w:type="dxa"/>
+              <w:bottom w:w="80" w:type="dxa"/>
+              <w:start w:w="120" w:type="dxa"/>
+              <w:end w:w="120" w:type="dxa"/>
+            </w:tcMar>
+          </w:tcPr>
+          <w:p>
+            <w:pPr>
+              <w:spacing w:after="0" w:line="280" w:lineRule="auto"/>
+              <w:jc w:val="left"/>
+            </w:pPr>
+            <w:r>
+              <w:rPr>
+                <w:rFonts w:ascii="Calibri" w:hAnsi="Calibri" w:eastAsia="SimSun"/>
+                <w:b w:val="0"/>
+                <w:sz w:val="20"/>
+              </w:rPr>
+              <w:t>三等奖</w:t>
+            </w:r>
+          </w:p>
+        </w:tc>
+        <w:tc>
+          <w:tcPr>
+            <w:tcW w:type="dxa" w:w="3760"/>
+            <w:vAlign w:val="center"/>
+            <w:tcMar>
+              <w:top w:w="80" w:type="dxa"/>
+              <w:bottom w:w="80" w:type="dxa"/>
+              <w:start w:w="120" w:type="dxa"/>
+              <w:end w:w="120" w:type="dxa"/>
+            </w:tcMar>
+          </w:tcPr>
+          <w:p>
+            <w:pPr>
+              <w:spacing w:after="0" w:line="280" w:lineRule="auto"/>
+              <w:jc w:val="left"/>
+            </w:pPr>
+            <w:r>
+              <w:rPr>
+                <w:rFonts w:ascii="Calibri" w:hAnsi="Calibri" w:eastAsia="SimSun"/>
+                <w:b w:val="0"/>
+                <w:sz w:val="20"/>
+              </w:rPr>
+              <w:t>支撑跨年级竞赛团队运行和常态化训练机制建设</w:t>
+            </w:r>
+          </w:p>
+        </w:tc>
+      </w:tr>
+      <w:tr>
+        <w:tc>
+          <w:tcPr>
+            <w:tcW w:type="dxa" w:w="2200"/>
+            <w:vAlign w:val="center"/>
+            <w:tcMar>
+              <w:top w:w="80" w:type="dxa"/>
+              <w:bottom w:w="80" w:type="dxa"/>
+              <w:start w:w="120" w:type="dxa"/>
+              <w:end w:w="120" w:type="dxa"/>
+            </w:tcMar>
+          </w:tcPr>
+          <w:p>
+            <w:pPr>
+              <w:spacing w:after="0" w:line="280" w:lineRule="auto"/>
+              <w:jc w:val="left"/>
+            </w:pPr>
+            <w:r>
+              <w:rPr>
+                <w:rFonts w:ascii="Calibri" w:hAnsi="Calibri" w:eastAsia="SimSun"/>
+                <w:b w:val="0"/>
+                <w:sz w:val="20"/>
+              </w:rPr>
+              <w:t>RoboCom 机器人开发者大赛</w:t>
+            </w:r>
+          </w:p>
+        </w:tc>
+        <w:tc>
+          <w:tcPr>
+            <w:tcW w:type="dxa" w:w="3400"/>
+            <w:vAlign w:val="center"/>
+            <w:tcMar>
+              <w:top w:w="80" w:type="dxa"/>
+              <w:bottom w:w="80" w:type="dxa"/>
+              <w:start w:w="120" w:type="dxa"/>
+              <w:end w:w="120" w:type="dxa"/>
+            </w:tcMar>
+          </w:tcPr>
+          <w:p>
+            <w:pPr>
+              <w:spacing w:after="0" w:line="280" w:lineRule="auto"/>
+              <w:jc w:val="left"/>
+            </w:pPr>
+            <w:r>
+              <w:rPr>
+                <w:rFonts w:ascii="Calibri" w:hAnsi="Calibri" w:eastAsia="SimSun"/>
+                <w:b w:val="0"/>
+                <w:sz w:val="20"/>
+              </w:rPr>
+              <w:t>全国一等奖</w:t>
+            </w:r>
+          </w:p>
+        </w:tc>
+        <w:tc>
+          <w:tcPr>
+            <w:tcW w:type="dxa" w:w="3760"/>
+            <w:vAlign w:val="center"/>
+            <w:tcMar>
+              <w:top w:w="80" w:type="dxa"/>
+              <w:bottom w:w="80" w:type="dxa"/>
+              <w:start w:w="120" w:type="dxa"/>
+              <w:end w:w="120" w:type="dxa"/>
+            </w:tcMar>
+          </w:tcPr>
+          <w:p>
+            <w:pPr>
+              <w:spacing w:after="0" w:line="280" w:lineRule="auto"/>
+              <w:jc w:val="left"/>
+            </w:pPr>
+            <w:r>
+              <w:rPr>
+                <w:rFonts w:ascii="Calibri" w:hAnsi="Calibri" w:eastAsia="SimSun"/>
+                <w:b w:val="0"/>
+                <w:sz w:val="20"/>
+              </w:rPr>
+              <w:t>支撑学生机器人开发、任务分解和系统集成能力培养</w:t>
+            </w:r>
+          </w:p>
+        </w:tc>
+      </w:tr>
+      <w:tr>
+        <w:tc>
+          <w:tcPr>
+            <w:tcW w:type="dxa" w:w="2200"/>
+            <w:vAlign w:val="center"/>
+            <w:tcMar>
+              <w:top w:w="80" w:type="dxa"/>
+              <w:bottom w:w="80" w:type="dxa"/>
+              <w:start w:w="120" w:type="dxa"/>
+              <w:end w:w="120" w:type="dxa"/>
+            </w:tcMar>
+          </w:tcPr>
+          <w:p>
+            <w:pPr>
+              <w:spacing w:after="0" w:line="280" w:lineRule="auto"/>
+              <w:jc w:val="left"/>
+            </w:pPr>
+            <w:r>
+              <w:rPr>
+                <w:rFonts w:ascii="Calibri" w:hAnsi="Calibri" w:eastAsia="SimSun"/>
+                <w:b w:val="0"/>
+                <w:sz w:val="20"/>
+              </w:rPr>
+              <w:t>RoboCom 机器人开发者大赛江苏省赛</w:t>
+            </w:r>
+          </w:p>
+        </w:tc>
+        <w:tc>
+          <w:tcPr>
+            <w:tcW w:type="dxa" w:w="3400"/>
+            <w:vAlign w:val="center"/>
+            <w:tcMar>
+              <w:top w:w="80" w:type="dxa"/>
+              <w:bottom w:w="80" w:type="dxa"/>
+              <w:start w:w="120" w:type="dxa"/>
+              <w:end w:w="120" w:type="dxa"/>
+            </w:tcMar>
+          </w:tcPr>
+          <w:p>
+            <w:pPr>
+              <w:spacing w:after="0" w:line="280" w:lineRule="auto"/>
+              <w:jc w:val="left"/>
+            </w:pPr>
+            <w:r>
+              <w:rPr>
+                <w:rFonts w:ascii="Calibri" w:hAnsi="Calibri" w:eastAsia="SimSun"/>
+                <w:b w:val="0"/>
+                <w:sz w:val="20"/>
+              </w:rPr>
+              <w:t>江苏省一等奖</w:t>
+            </w:r>
+          </w:p>
+        </w:tc>
+        <w:tc>
+          <w:tcPr>
+            <w:tcW w:type="dxa" w:w="3760"/>
+            <w:vAlign w:val="center"/>
+            <w:tcMar>
+              <w:top w:w="80" w:type="dxa"/>
+              <w:bottom w:w="80" w:type="dxa"/>
+              <w:start w:w="120" w:type="dxa"/>
+              <w:end w:w="120" w:type="dxa"/>
+            </w:tcMar>
+          </w:tcPr>
+          <w:p>
+            <w:pPr>
+              <w:spacing w:after="0" w:line="280" w:lineRule="auto"/>
+              <w:jc w:val="left"/>
+            </w:pPr>
+            <w:r>
+              <w:rPr>
+                <w:rFonts w:ascii="Calibri" w:hAnsi="Calibri" w:eastAsia="SimSun"/>
+                <w:b w:val="0"/>
+                <w:sz w:val="20"/>
+              </w:rPr>
+              <w:t>支撑地方高校工程类学科竞赛育人成效的区域性体现</w:t>
+            </w:r>
+          </w:p>
+        </w:tc>
+      </w:tr>
+      <w:tr>
+        <w:tc>
+          <w:tcPr>
+            <w:tcW w:type="dxa" w:w="2200"/>
+            <w:vAlign w:val="center"/>
+            <w:tcMar>
+              <w:top w:w="80" w:type="dxa"/>
+              <w:bottom w:w="80" w:type="dxa"/>
+              <w:start w:w="120" w:type="dxa"/>
+              <w:end w:w="120" w:type="dxa"/>
+            </w:tcMar>
+          </w:tcPr>
+          <w:p>
+            <w:pPr>
+              <w:spacing w:after="0" w:line="280" w:lineRule="auto"/>
+              <w:jc w:val="left"/>
+            </w:pPr>
+            <w:r>
+              <w:rPr>
+                <w:rFonts w:ascii="Calibri" w:hAnsi="Calibri" w:eastAsia="SimSun"/>
+                <w:b w:val="0"/>
+                <w:sz w:val="20"/>
+              </w:rPr>
+              <w:t>开拓者协会社团</w:t>
+            </w:r>
+          </w:p>
+        </w:tc>
+        <w:tc>
+          <w:tcPr>
+            <w:tcW w:type="dxa" w:w="3400"/>
+            <w:vAlign w:val="center"/>
+            <w:tcMar>
+              <w:top w:w="80" w:type="dxa"/>
+              <w:bottom w:w="80" w:type="dxa"/>
+              <w:start w:w="120" w:type="dxa"/>
+              <w:end w:w="120" w:type="dxa"/>
+            </w:tcMar>
+          </w:tcPr>
+          <w:p>
+            <w:pPr>
+              <w:spacing w:after="0" w:line="280" w:lineRule="auto"/>
+              <w:jc w:val="left"/>
+            </w:pPr>
+            <w:r>
+              <w:rPr>
+                <w:rFonts w:ascii="Calibri" w:hAnsi="Calibri" w:eastAsia="SimSun"/>
+                <w:b w:val="0"/>
+                <w:sz w:val="20"/>
+              </w:rPr>
+              <w:t>学生竞赛组织平台</w:t>
+            </w:r>
+          </w:p>
+        </w:tc>
+        <w:tc>
+          <w:tcPr>
+            <w:tcW w:type="dxa" w:w="3760"/>
+            <w:vAlign w:val="center"/>
+            <w:tcMar>
+              <w:top w:w="80" w:type="dxa"/>
+              <w:bottom w:w="80" w:type="dxa"/>
+              <w:start w:w="120" w:type="dxa"/>
+              <w:end w:w="120" w:type="dxa"/>
+            </w:tcMar>
+          </w:tcPr>
+          <w:p>
+            <w:pPr>
+              <w:spacing w:after="0" w:line="280" w:lineRule="auto"/>
+              <w:jc w:val="left"/>
+            </w:pPr>
+            <w:r>
+              <w:rPr>
+                <w:rFonts w:ascii="Calibri" w:hAnsi="Calibri" w:eastAsia="SimSun"/>
+                <w:b w:val="0"/>
+                <w:sz w:val="20"/>
+              </w:rPr>
+              <w:t>支撑“社团+项目+竞赛”的学生自主训练与梯队培养机制</w:t>
+            </w:r>
+          </w:p>
+        </w:tc>
+      </w:tr>
+    </w:tbl>
+    <w:p>
+      <w:pPr>
+        <w:spacing w:after="120"/>
+      </w:pPr>
+    </w:p>
+    <w:p>
+      <w:pPr>
         <w:pStyle w:val="Heading1"/>
       </w:pPr>
       <w:r>

</xml_diff>